<commit_message>
docs: add Step 3 theory section on linear grammars
</commit_message>
<xml_diff>
--- a/Step 2/Initial_Description_and_Analysis.docx
+++ b/Step 2/Initial_Description_and_Analysis.docx
@@ -4,21 +4,25 @@
   <w:body>
     <w:p>
       <w:pPr>
-        <w:spacing w:after="240"/>
+        <w:spacing w:after="40"/>
         <w:jc w:val="center"/>
-        <w:rPr>
-          <w:lang w:val="en-US"/>
-        </w:rPr>
-      </w:pPr>
-      <w:r>
         <w:rPr>
           <w:b/>
           <w:bCs/>
-          <w:sz w:val="28"/>
-          <w:szCs w:val="28"/>
-          <w:lang w:val="en-US"/>
-        </w:rPr>
-        <w:t>CYK VARIANTS DESCRIPTION &amp; ANALYSIS</w:t>
+          <w:sz w:val="32"/>
+          <w:szCs w:val="32"/>
+          <w:lang w:val="en-US"/>
+        </w:rPr>
+      </w:pPr>
+      <w:r>
+        <w:rPr>
+          <w:b/>
+          <w:bCs/>
+          <w:sz w:val="32"/>
+          <w:szCs w:val="32"/>
+          <w:lang w:val="en-US"/>
+        </w:rPr>
+        <w:t>CYK Parsing: Algorithm Variants, Complexity Analysis, and Linear Grammars</w:t>
       </w:r>
     </w:p>
     <w:p>
@@ -40,11 +44,15 @@
       <w:pPr>
         <w:spacing w:after="240"/>
         <w:jc w:val="center"/>
+        <w:rPr>
+          <w:lang w:val="en-US"/>
+        </w:rPr>
       </w:pPr>
       <w:r>
         <w:rPr>
           <w:sz w:val="18"/>
           <w:szCs w:val="18"/>
+          <w:lang w:val="en-US"/>
         </w:rPr>
         <w:t>ngsn0001</w:t>
       </w:r>
@@ -87,23 +95,7 @@
           <w:szCs w:val="18"/>
           <w:lang w:val="en-US"/>
         </w:rPr>
-        <w:t xml:space="preserve">We compare three algorithms for </w:t>
-      </w:r>
-      <w:r>
-        <w:rPr>
-          <w:sz w:val="18"/>
-          <w:szCs w:val="18"/>
-          <w:lang w:val="en-US"/>
-        </w:rPr>
-        <w:t>recognizing</w:t>
-      </w:r>
-      <w:r>
-        <w:rPr>
-          <w:sz w:val="18"/>
-          <w:szCs w:val="18"/>
-          <w:lang w:val="en-US"/>
-        </w:rPr>
-        <w:t xml:space="preserve"> strings of a context-free grammar in Chomsky normal form: a naive recursive parser, a top-down parser with </w:t>
+        <w:t xml:space="preserve">We compare three algorithms for recognizing strings of a context-free grammar in Chomsky normal form: a naive recursive parser, a top-down parser with </w:t>
       </w:r>
       <w:proofErr w:type="spellStart"/>
       <w:r>
@@ -602,15 +594,7 @@
         <w:pStyle w:val="Ttulo2"/>
       </w:pPr>
       <w:r>
-        <w:t>2.2 The Cocke–Younger–</w:t>
-      </w:r>
-      <w:proofErr w:type="spellStart"/>
-      <w:r>
-        <w:t>Kasami</w:t>
-      </w:r>
-      <w:proofErr w:type="spellEnd"/>
-      <w:r>
-        <w:t xml:space="preserve"> Algorithm</w:t>
+        <w:t>2.2 The Cocke–Younger–Kasami Algorithm</w:t>
       </w:r>
     </w:p>
     <w:p>
@@ -14086,35 +14070,7 @@
         <w:rPr>
           <w:lang w:val="en-US"/>
         </w:rPr>
-        <w:t xml:space="preserve"> On the accepted string </w:t>
-      </w:r>
-      <w:proofErr w:type="gramStart"/>
-      <w:r>
-        <w:rPr>
-          <w:lang w:val="en-US"/>
-        </w:rPr>
-        <w:t>()(</w:t>
-      </w:r>
-      <w:proofErr w:type="gramEnd"/>
-      <w:r>
-        <w:rPr>
-          <w:lang w:val="en-US"/>
-        </w:rPr>
-        <w:t>)</w:t>
-      </w:r>
-      <w:proofErr w:type="gramStart"/>
-      <w:r>
-        <w:rPr>
-          <w:lang w:val="en-US"/>
-        </w:rPr>
-        <w:t>…(</w:t>
-      </w:r>
-      <w:proofErr w:type="gramEnd"/>
-      <w:r>
-        <w:rPr>
-          <w:lang w:val="en-US"/>
-        </w:rPr>
-        <w:t xml:space="preserve">) (Table 4), top-down needs only 4n − 2 operations (1598 and 0.12 </w:t>
+        <w:t xml:space="preserve"> On the accepted string ()()…() (Table 4), top-down needs only 4n − 2 operations (1598 and 0.12 </w:t>
       </w:r>
       <w:proofErr w:type="spellStart"/>
       <w:r>
@@ -14314,35 +14270,7 @@
         <w:rPr>
           <w:lang w:val="en-US"/>
         </w:rPr>
-        <w:t xml:space="preserve">The Time/n³ columns support these observations. For top-down on ((…)) and </w:t>
-      </w:r>
-      <w:proofErr w:type="gramStart"/>
-      <w:r>
-        <w:rPr>
-          <w:lang w:val="en-US"/>
-        </w:rPr>
-        <w:t>()(</w:t>
-      </w:r>
-      <w:proofErr w:type="gramEnd"/>
-      <w:r>
-        <w:rPr>
-          <w:lang w:val="en-US"/>
-        </w:rPr>
-        <w:t>)</w:t>
-      </w:r>
-      <w:proofErr w:type="gramStart"/>
-      <w:r>
-        <w:rPr>
-          <w:lang w:val="en-US"/>
-        </w:rPr>
-        <w:t>…()( the</w:t>
-      </w:r>
-      <w:proofErr w:type="gramEnd"/>
-      <w:r>
-        <w:rPr>
-          <w:lang w:val="en-US"/>
-        </w:rPr>
-        <w:t xml:space="preserve"> ratio </w:t>
+        <w:t xml:space="preserve">The Time/n³ columns support these observations. For top-down on ((…)) and ()()…()( the ratio </w:t>
       </w:r>
       <w:proofErr w:type="spellStart"/>
       <w:r>
@@ -14356,77 +14284,7 @@
         <w:rPr>
           <w:lang w:val="en-US"/>
         </w:rPr>
-        <w:t xml:space="preserve"> (≈ 0.65 and ≈ 1.0 ns), consistent with cubic growth, whereas on </w:t>
-      </w:r>
-      <w:proofErr w:type="gramStart"/>
-      <w:r>
-        <w:rPr>
-          <w:lang w:val="en-US"/>
-        </w:rPr>
-        <w:t>()(</w:t>
-      </w:r>
-      <w:proofErr w:type="gramEnd"/>
-      <w:r>
-        <w:rPr>
-          <w:lang w:val="en-US"/>
-        </w:rPr>
-        <w:t>)</w:t>
-      </w:r>
-      <w:proofErr w:type="gramStart"/>
-      <w:r>
-        <w:rPr>
-          <w:lang w:val="en-US"/>
-        </w:rPr>
-        <w:t>…(</w:t>
-      </w:r>
-      <w:proofErr w:type="gramEnd"/>
-      <w:r>
-        <w:rPr>
-          <w:lang w:val="en-US"/>
-        </w:rPr>
-        <w:t xml:space="preserve">) </w:t>
-      </w:r>
-      <w:proofErr w:type="gramStart"/>
-      <w:r>
-        <w:rPr>
-          <w:lang w:val="en-US"/>
-        </w:rPr>
-        <w:t>and )</w:t>
-      </w:r>
-      <w:proofErr w:type="gramEnd"/>
-      <w:r>
-        <w:rPr>
-          <w:lang w:val="en-US"/>
-        </w:rPr>
-        <w:t>(</w:t>
-      </w:r>
-      <w:proofErr w:type="gramStart"/>
-      <w:r>
-        <w:rPr>
-          <w:lang w:val="en-US"/>
-        </w:rPr>
-        <w:t>)(</w:t>
-      </w:r>
-      <w:proofErr w:type="gramEnd"/>
-      <w:r>
-        <w:rPr>
-          <w:lang w:val="en-US"/>
-        </w:rPr>
-        <w:t>)</w:t>
-      </w:r>
-      <w:proofErr w:type="gramStart"/>
-      <w:r>
-        <w:rPr>
-          <w:lang w:val="en-US"/>
-        </w:rPr>
-        <w:t>…(</w:t>
-      </w:r>
-      <w:proofErr w:type="gramEnd"/>
-      <w:r>
-        <w:rPr>
-          <w:lang w:val="en-US"/>
-        </w:rPr>
-        <w:t>) it approaches zero, since the running time is sub-cubic. For bottom-up the ratio decreases with n, reaching ≈ 0.2 ns in Tables 4–6 while still falling in Table 3. The larger values for small n probably reflect fixed overheads such as JIT warm-up.</w:t>
+        <w:t xml:space="preserve"> (≈ 0.65 and ≈ 1.0 ns), consistent with cubic growth, whereas on ()()…() and )()()…() it approaches zero, since the running time is sub-cubic. For bottom-up the ratio decreases with n, reaching ≈ 0.2 ns in Tables 4–6 while still falling in Table 3. The larger values for small n probably reflect fixed overheads such as JIT warm-up.</w:t>
       </w:r>
     </w:p>
     <w:p>
@@ -18088,6 +17946,15 @@
     </w:p>
     <w:p>
       <w:pPr>
+        <w:spacing w:after="120"/>
+        <w:jc w:val="both"/>
+        <w:rPr>
+          <w:lang w:val="en-US"/>
+        </w:rPr>
+      </w:pPr>
+    </w:p>
+    <w:p>
+      <w:pPr>
         <w:pStyle w:val="Ttulo1"/>
         <w:rPr>
           <w:lang w:val="en-US"/>
@@ -18097,6 +17964,1638 @@
         <w:rPr>
           <w:lang w:val="en-US"/>
         </w:rPr>
+        <w:t>7</w:t>
+      </w:r>
+      <w:r>
+        <w:rPr>
+          <w:lang w:val="en-US"/>
+        </w:rPr>
+        <w:t xml:space="preserve"> </w:t>
+      </w:r>
+      <w:r>
+        <w:rPr>
+          <w:lang w:val="en-US"/>
+        </w:rPr>
+        <w:t>Linear Grammar</w:t>
+      </w:r>
+      <w:r>
+        <w:rPr>
+          <w:lang w:val="en-US"/>
+        </w:rPr>
+        <w:t>s</w:t>
+      </w:r>
+    </w:p>
+    <w:p>
+      <w:pPr>
+        <w:spacing w:after="120"/>
+        <w:jc w:val="both"/>
+        <w:rPr>
+          <w:b/>
+          <w:bCs/>
+          <w:lang w:val="en-US"/>
+        </w:rPr>
+      </w:pPr>
+      <w:r>
+        <w:rPr>
+          <w:b/>
+          <w:bCs/>
+          <w:lang w:val="en-US"/>
+        </w:rPr>
+        <w:t>7.1 Definition</w:t>
+      </w:r>
+    </w:p>
+    <w:p>
+      <w:pPr>
+        <w:spacing w:after="120"/>
+        <w:jc w:val="both"/>
+        <w:rPr>
+          <w:lang w:val="en-US"/>
+        </w:rPr>
+      </w:pPr>
+      <w:r>
+        <w:rPr>
+          <w:lang w:val="en-US"/>
+        </w:rPr>
+        <w:t xml:space="preserve">A context-free grammar is linear if every right-hand side of every rule contains at most one nonterminal symbol. To stay close to Chomsky normal form, we consider linear </w:t>
+      </w:r>
+      <w:proofErr w:type="gramStart"/>
+      <w:r>
+        <w:rPr>
+          <w:lang w:val="en-US"/>
+        </w:rPr>
+        <w:t>grammars</w:t>
+      </w:r>
+      <w:proofErr w:type="gramEnd"/>
+      <w:r>
+        <w:rPr>
+          <w:lang w:val="en-US"/>
+        </w:rPr>
+        <w:t xml:space="preserve"> in linear Chomsky normal form every rule </w:t>
+      </w:r>
+      <w:r>
+        <w:rPr>
+          <w:lang w:val="en-US"/>
+        </w:rPr>
+        <w:t>in</w:t>
+      </w:r>
+      <w:r>
+        <w:rPr>
+          <w:lang w:val="en-US"/>
+        </w:rPr>
+        <w:t xml:space="preserve"> one of the forms</w:t>
+      </w:r>
+    </w:p>
+    <w:p>
+      <w:pPr>
+        <w:spacing w:after="120"/>
+        <w:jc w:val="both"/>
+        <w:rPr>
+          <w:lang w:val="en-US"/>
+        </w:rPr>
+      </w:pPr>
+      <w:r>
+        <w:rPr>
+          <w:lang w:val="en-US"/>
+        </w:rPr>
+        <w:t>A → a, A → a B, A → B a,</w:t>
+      </w:r>
+    </w:p>
+    <w:p>
+      <w:pPr>
+        <w:spacing w:after="120"/>
+        <w:jc w:val="both"/>
+        <w:rPr>
+          <w:lang w:val="en-US"/>
+        </w:rPr>
+      </w:pPr>
+      <w:r>
+        <w:rPr>
+          <w:lang w:val="en-US"/>
+        </w:rPr>
+        <w:t xml:space="preserve">where a is a terminal and A, B are </w:t>
+      </w:r>
+      <w:proofErr w:type="spellStart"/>
+      <w:r>
+        <w:rPr>
+          <w:lang w:val="en-US"/>
+        </w:rPr>
+        <w:t>nonterminals</w:t>
+      </w:r>
+      <w:proofErr w:type="spellEnd"/>
+      <w:r>
+        <w:rPr>
+          <w:lang w:val="en-US"/>
+        </w:rPr>
+        <w:t xml:space="preserve">. Unlike ordinary CNF, a rule never has two </w:t>
+      </w:r>
+      <w:proofErr w:type="spellStart"/>
+      <w:r>
+        <w:rPr>
+          <w:lang w:val="en-US"/>
+        </w:rPr>
+        <w:t>nonterminals</w:t>
+      </w:r>
+      <w:proofErr w:type="spellEnd"/>
+      <w:r>
+        <w:rPr>
+          <w:lang w:val="en-US"/>
+        </w:rPr>
+        <w:t xml:space="preserve"> on its right-hand side. An example is S → A c | b, A → a S | a B, B → b S.</w:t>
+      </w:r>
+    </w:p>
+    <w:p>
+      <w:pPr>
+        <w:spacing w:after="120"/>
+        <w:jc w:val="both"/>
+        <w:rPr>
+          <w:lang w:val="en-US"/>
+        </w:rPr>
+      </w:pPr>
+      <w:r>
+        <w:rPr>
+          <w:lang w:val="en-US"/>
+        </w:rPr>
+        <w:t xml:space="preserve">Because at most one nonterminal appears per rule, a derivation never branches into two independent </w:t>
+      </w:r>
+      <w:proofErr w:type="spellStart"/>
+      <w:r>
+        <w:rPr>
+          <w:lang w:val="en-US"/>
+        </w:rPr>
+        <w:t>subderivations</w:t>
+      </w:r>
+      <w:proofErr w:type="spellEnd"/>
+      <w:r>
+        <w:rPr>
+          <w:lang w:val="en-US"/>
+        </w:rPr>
+        <w:t xml:space="preserve"> the way S → B C does in the general case: the nonterminal of a rule always "carries" the rest of the derivation, with one terminal symbol consumed at a fixed end (left, for A → a B, or right, for A → B a) at each step.</w:t>
+      </w:r>
+    </w:p>
+    <w:p>
+      <w:pPr>
+        <w:spacing w:after="120"/>
+        <w:jc w:val="both"/>
+        <w:rPr>
+          <w:b/>
+          <w:bCs/>
+          <w:lang w:val="en-US"/>
+        </w:rPr>
+      </w:pPr>
+      <w:r>
+        <w:rPr>
+          <w:b/>
+          <w:bCs/>
+          <w:lang w:val="en-US"/>
+        </w:rPr>
+        <w:t>7.2 Method 1: Preprocessing into Ordinary CNF</w:t>
+      </w:r>
+    </w:p>
+    <w:p>
+      <w:pPr>
+        <w:spacing w:after="120"/>
+        <w:jc w:val="both"/>
+        <w:rPr>
+          <w:lang w:val="en-US"/>
+        </w:rPr>
+      </w:pPr>
+      <w:r>
+        <w:rPr>
+          <w:b/>
+          <w:bCs/>
+          <w:lang w:val="en-US"/>
+        </w:rPr>
+        <w:t>Idea.</w:t>
+      </w:r>
+      <w:r>
+        <w:rPr>
+          <w:lang w:val="en-US"/>
+        </w:rPr>
+        <w:t xml:space="preserve"> Any linear-CNF rule A → a B can be rewritten in ordinary CNF by introducing a fresh nonterminal </w:t>
+      </w:r>
+      <w:proofErr w:type="spellStart"/>
+      <w:r>
+        <w:rPr>
+          <w:lang w:val="en-US"/>
+        </w:rPr>
+        <w:t>X_a</w:t>
+      </w:r>
+      <w:proofErr w:type="spellEnd"/>
+      <w:r>
+        <w:rPr>
+          <w:lang w:val="en-US"/>
+        </w:rPr>
+        <w:t xml:space="preserve"> with the rule </w:t>
+      </w:r>
+      <w:proofErr w:type="spellStart"/>
+      <w:r>
+        <w:rPr>
+          <w:lang w:val="en-US"/>
+        </w:rPr>
+        <w:t>X_a</w:t>
+      </w:r>
+      <w:proofErr w:type="spellEnd"/>
+      <w:r>
+        <w:rPr>
+          <w:lang w:val="en-US"/>
+        </w:rPr>
+        <w:t xml:space="preserve"> → a, and replacing the original rule by A → </w:t>
+      </w:r>
+      <w:proofErr w:type="spellStart"/>
+      <w:r>
+        <w:rPr>
+          <w:lang w:val="en-US"/>
+        </w:rPr>
+        <w:t>X_a</w:t>
+      </w:r>
+      <w:proofErr w:type="spellEnd"/>
+      <w:r>
+        <w:rPr>
+          <w:lang w:val="en-US"/>
+        </w:rPr>
+        <w:t xml:space="preserve"> B. Symmetrically, A → B a becomes A → B </w:t>
+      </w:r>
+      <w:proofErr w:type="spellStart"/>
+      <w:r>
+        <w:rPr>
+          <w:lang w:val="en-US"/>
+        </w:rPr>
+        <w:t>X_a</w:t>
+      </w:r>
+      <w:proofErr w:type="spellEnd"/>
+      <w:r>
+        <w:rPr>
+          <w:lang w:val="en-US"/>
+        </w:rPr>
+        <w:t xml:space="preserve">. Only one auxiliary nonterminal </w:t>
+      </w:r>
+      <w:proofErr w:type="spellStart"/>
+      <w:r>
+        <w:rPr>
+          <w:lang w:val="en-US"/>
+        </w:rPr>
+        <w:t>X_a</w:t>
+      </w:r>
+      <w:proofErr w:type="spellEnd"/>
+      <w:r>
+        <w:rPr>
+          <w:lang w:val="en-US"/>
+        </w:rPr>
+        <w:t xml:space="preserve"> is needed per terminal a, shared by every rule that uses it. The resulting grammar has |V| + |</w:t>
+      </w:r>
+      <w:r>
+        <w:t>Σ</w:t>
+      </w:r>
+      <w:r>
+        <w:rPr>
+          <w:lang w:val="en-US"/>
+        </w:rPr>
+        <w:t xml:space="preserve">| </w:t>
+      </w:r>
+      <w:proofErr w:type="spellStart"/>
+      <w:r>
+        <w:rPr>
+          <w:lang w:val="en-US"/>
+        </w:rPr>
+        <w:t>nonterminals</w:t>
+      </w:r>
+      <w:proofErr w:type="spellEnd"/>
+      <w:r>
+        <w:rPr>
+          <w:lang w:val="en-US"/>
+        </w:rPr>
+        <w:t xml:space="preserve"> (at most) instead of |V|, but generates </w:t>
+      </w:r>
+      <w:proofErr w:type="gramStart"/>
+      <w:r>
+        <w:rPr>
+          <w:lang w:val="en-US"/>
+        </w:rPr>
+        <w:t>exactly the same</w:t>
+      </w:r>
+      <w:proofErr w:type="gramEnd"/>
+      <w:r>
+        <w:rPr>
+          <w:lang w:val="en-US"/>
+        </w:rPr>
+        <w:t xml:space="preserve"> </w:t>
+      </w:r>
+      <w:r>
+        <w:rPr>
+          <w:lang w:val="en-US"/>
+        </w:rPr>
+        <w:lastRenderedPageBreak/>
+        <w:t xml:space="preserve">language, since </w:t>
+      </w:r>
+      <w:proofErr w:type="spellStart"/>
+      <w:r>
+        <w:rPr>
+          <w:lang w:val="en-US"/>
+        </w:rPr>
+        <w:t>X_a</w:t>
+      </w:r>
+      <w:proofErr w:type="spellEnd"/>
+      <w:r>
+        <w:rPr>
+          <w:lang w:val="en-US"/>
+        </w:rPr>
+        <w:t xml:space="preserve"> derives only the string a. Once converted, the grammar can be parsed with the general CYK algorithm already implemented in Step 1/2, without any further modification.</w:t>
+      </w:r>
+    </w:p>
+    <w:p>
+      <w:pPr>
+        <w:spacing w:after="120"/>
+        <w:jc w:val="both"/>
+        <w:rPr>
+          <w:lang w:val="en-US"/>
+        </w:rPr>
+      </w:pPr>
+      <w:r>
+        <w:rPr>
+          <w:b/>
+          <w:bCs/>
+          <w:lang w:val="en-US"/>
+        </w:rPr>
+        <w:t>Hypothesis.</w:t>
+      </w:r>
+      <w:r>
+        <w:rPr>
+          <w:lang w:val="en-US"/>
+        </w:rPr>
+        <w:t xml:space="preserve"> This preprocessing does not change the asymptotic running time of the parser. The general CYK algorithm has no notion of linearity: it still tries every split point k for every substring and every rule, exactly as it would for </w:t>
+      </w:r>
+      <w:proofErr w:type="gramStart"/>
+      <w:r>
+        <w:rPr>
+          <w:lang w:val="en-US"/>
+        </w:rPr>
+        <w:t>an arbitrary</w:t>
+      </w:r>
+      <w:proofErr w:type="gramEnd"/>
+      <w:r>
+        <w:rPr>
+          <w:lang w:val="en-US"/>
+        </w:rPr>
+        <w:t xml:space="preserve"> CNF grammar. We therefore expect this method to remain </w:t>
+      </w:r>
+      <w:proofErr w:type="gramStart"/>
+      <w:r>
+        <w:rPr>
+          <w:lang w:val="en-US"/>
+        </w:rPr>
+        <w:t>O(</w:t>
+      </w:r>
+      <w:proofErr w:type="gramEnd"/>
+      <w:r>
+        <w:rPr>
+          <w:lang w:val="en-US"/>
+        </w:rPr>
+        <w:t xml:space="preserve">|V| · |R| · n³) [cite the same bound as Section 3], even though the underlying grammar is linear. The only expected difference is a small constant-factor effect from the larger number of </w:t>
+      </w:r>
+      <w:proofErr w:type="spellStart"/>
+      <w:r>
+        <w:rPr>
+          <w:lang w:val="en-US"/>
+        </w:rPr>
+        <w:t>nonterminals</w:t>
+      </w:r>
+      <w:proofErr w:type="spellEnd"/>
+      <w:r>
+        <w:rPr>
+          <w:lang w:val="en-US"/>
+        </w:rPr>
+        <w:t xml:space="preserve"> and rules after the </w:t>
+      </w:r>
+      <w:proofErr w:type="spellStart"/>
+      <w:r>
+        <w:rPr>
+          <w:lang w:val="en-US"/>
+        </w:rPr>
+        <w:t>X_a's</w:t>
+      </w:r>
+      <w:proofErr w:type="spellEnd"/>
+      <w:r>
+        <w:rPr>
+          <w:lang w:val="en-US"/>
+        </w:rPr>
+        <w:t xml:space="preserve"> are introduced, and possibly a lower practical operation count if the extra </w:t>
+      </w:r>
+      <w:proofErr w:type="spellStart"/>
+      <w:r>
+        <w:rPr>
+          <w:lang w:val="en-US"/>
+        </w:rPr>
+        <w:t>nonterminals</w:t>
+      </w:r>
+      <w:proofErr w:type="spellEnd"/>
+      <w:r>
+        <w:rPr>
+          <w:lang w:val="en-US"/>
+        </w:rPr>
+        <w:t xml:space="preserve"> let the lazy (top-down) variant fail faster, which is an empirical question to check rather than something argued theoretically.</w:t>
+      </w:r>
+    </w:p>
+    <w:p>
+      <w:pPr>
+        <w:spacing w:after="120"/>
+        <w:jc w:val="both"/>
+        <w:rPr>
+          <w:b/>
+          <w:bCs/>
+          <w:lang w:val="en-US"/>
+        </w:rPr>
+      </w:pPr>
+      <w:r>
+        <w:rPr>
+          <w:b/>
+          <w:bCs/>
+          <w:lang w:val="en-US"/>
+        </w:rPr>
+        <w:t>7.3 Method 2: A Specialized Algorithm for Linear Grammars</w:t>
+      </w:r>
+    </w:p>
+    <w:p>
+      <w:pPr>
+        <w:spacing w:after="120"/>
+        <w:jc w:val="both"/>
+        <w:rPr>
+          <w:lang w:val="en-US"/>
+        </w:rPr>
+      </w:pPr>
+      <w:r>
+        <w:rPr>
+          <w:b/>
+          <w:bCs/>
+          <w:lang w:val="en-US"/>
+        </w:rPr>
+        <w:t>Idea.</w:t>
+      </w:r>
+      <w:r>
+        <w:rPr>
+          <w:lang w:val="en-US"/>
+        </w:rPr>
+        <w:t xml:space="preserve"> In the general CYK recurrence, a nonterminal A derives </w:t>
+      </w:r>
+      <w:proofErr w:type="gramStart"/>
+      <w:r>
+        <w:rPr>
+          <w:lang w:val="en-US"/>
+        </w:rPr>
+        <w:t>s[</w:t>
+      </w:r>
+      <w:proofErr w:type="spellStart"/>
+      <w:proofErr w:type="gramEnd"/>
+      <w:r>
+        <w:rPr>
+          <w:lang w:val="en-US"/>
+        </w:rPr>
+        <w:t>i</w:t>
+      </w:r>
+      <w:proofErr w:type="spellEnd"/>
+      <w:r>
+        <w:rPr>
+          <w:lang w:val="en-US"/>
+        </w:rPr>
+        <w:t xml:space="preserve">, j) (length ≥ 2) if there is a rule A → B C and a split point k with </w:t>
+      </w:r>
+      <w:proofErr w:type="spellStart"/>
+      <w:r>
+        <w:rPr>
+          <w:lang w:val="en-US"/>
+        </w:rPr>
+        <w:t>i</w:t>
+      </w:r>
+      <w:proofErr w:type="spellEnd"/>
+      <w:r>
+        <w:rPr>
+          <w:lang w:val="en-US"/>
+        </w:rPr>
+        <w:t xml:space="preserve"> &lt; k &lt; j such that B derives </w:t>
+      </w:r>
+      <w:proofErr w:type="gramStart"/>
+      <w:r>
+        <w:rPr>
+          <w:lang w:val="en-US"/>
+        </w:rPr>
+        <w:t>s[</w:t>
+      </w:r>
+      <w:proofErr w:type="spellStart"/>
+      <w:proofErr w:type="gramEnd"/>
+      <w:r>
+        <w:rPr>
+          <w:lang w:val="en-US"/>
+        </w:rPr>
+        <w:t>i</w:t>
+      </w:r>
+      <w:proofErr w:type="spellEnd"/>
+      <w:r>
+        <w:rPr>
+          <w:lang w:val="en-US"/>
+        </w:rPr>
+        <w:t xml:space="preserve">, k) and C derives </w:t>
+      </w:r>
+      <w:proofErr w:type="gramStart"/>
+      <w:r>
+        <w:rPr>
+          <w:lang w:val="en-US"/>
+        </w:rPr>
+        <w:t>s[</w:t>
+      </w:r>
+      <w:proofErr w:type="gramEnd"/>
+      <w:r>
+        <w:rPr>
+          <w:lang w:val="en-US"/>
+        </w:rPr>
+        <w:t xml:space="preserve">k, j); checking this requires trying all O(n) values of k. In a linear grammar this search is unnecessary: a rule A → a B fixes the terminal to position </w:t>
+      </w:r>
+      <w:proofErr w:type="spellStart"/>
+      <w:r>
+        <w:rPr>
+          <w:lang w:val="en-US"/>
+        </w:rPr>
+        <w:t>i</w:t>
+      </w:r>
+      <w:proofErr w:type="spellEnd"/>
+      <w:r>
+        <w:rPr>
+          <w:lang w:val="en-US"/>
+        </w:rPr>
+        <w:t xml:space="preserve">, so the only candidate split is k = </w:t>
+      </w:r>
+      <w:proofErr w:type="spellStart"/>
+      <w:r>
+        <w:rPr>
+          <w:lang w:val="en-US"/>
+        </w:rPr>
+        <w:t>i</w:t>
+      </w:r>
+      <w:proofErr w:type="spellEnd"/>
+      <w:r>
+        <w:rPr>
+          <w:lang w:val="en-US"/>
+        </w:rPr>
+        <w:t xml:space="preserve"> + 1; a rule A → B a fixes the terminal to position j − 1, so the only candidate split is k = j − 1. Formally, for a linear-CNF grammar, A derives </w:t>
+      </w:r>
+      <w:proofErr w:type="gramStart"/>
+      <w:r>
+        <w:rPr>
+          <w:lang w:val="en-US"/>
+        </w:rPr>
+        <w:t>s[</w:t>
+      </w:r>
+      <w:proofErr w:type="spellStart"/>
+      <w:proofErr w:type="gramEnd"/>
+      <w:r>
+        <w:rPr>
+          <w:lang w:val="en-US"/>
+        </w:rPr>
+        <w:t>i</w:t>
+      </w:r>
+      <w:proofErr w:type="spellEnd"/>
+      <w:r>
+        <w:rPr>
+          <w:lang w:val="en-US"/>
+        </w:rPr>
+        <w:t xml:space="preserve">, j) (j &gt; </w:t>
+      </w:r>
+      <w:proofErr w:type="spellStart"/>
+      <w:r>
+        <w:rPr>
+          <w:lang w:val="en-US"/>
+        </w:rPr>
+        <w:t>i</w:t>
+      </w:r>
+      <w:proofErr w:type="spellEnd"/>
+      <w:r>
+        <w:rPr>
+          <w:lang w:val="en-US"/>
+        </w:rPr>
+        <w:t xml:space="preserve"> + 1) if and only if</w:t>
+      </w:r>
+    </w:p>
+    <w:p>
+      <w:pPr>
+        <w:spacing w:after="120"/>
+        <w:jc w:val="both"/>
+        <w:rPr>
+          <w:lang w:val="en-US"/>
+        </w:rPr>
+      </w:pPr>
+      <w:r>
+        <w:rPr>
+          <w:lang w:val="en-US"/>
+        </w:rPr>
+        <w:t>(</w:t>
+      </w:r>
+      <w:r>
+        <w:rPr>
+          <w:rFonts w:ascii="Cambria Math" w:hAnsi="Cambria Math" w:cs="Cambria Math"/>
+          <w:lang w:val="en-US"/>
+        </w:rPr>
+        <w:t>∃</w:t>
+      </w:r>
+      <w:r>
+        <w:rPr>
+          <w:lang w:val="en-US"/>
+        </w:rPr>
+        <w:t xml:space="preserve"> rule A → a B with a = s[</w:t>
+      </w:r>
+      <w:proofErr w:type="spellStart"/>
+      <w:r>
+        <w:rPr>
+          <w:lang w:val="en-US"/>
+        </w:rPr>
+        <w:t>i</w:t>
+      </w:r>
+      <w:proofErr w:type="spellEnd"/>
+      <w:r>
+        <w:rPr>
+          <w:lang w:val="en-US"/>
+        </w:rPr>
+        <w:t xml:space="preserve">] and B derives </w:t>
+      </w:r>
+      <w:proofErr w:type="gramStart"/>
+      <w:r>
+        <w:rPr>
+          <w:lang w:val="en-US"/>
+        </w:rPr>
+        <w:t>s[</w:t>
+      </w:r>
+      <w:proofErr w:type="gramEnd"/>
+      <w:r>
+        <w:rPr>
+          <w:lang w:val="en-US"/>
+        </w:rPr>
+        <w:t>i+1, j)), or</w:t>
+      </w:r>
+      <w:r>
+        <w:rPr>
+          <w:lang w:val="en-US"/>
+        </w:rPr>
+        <w:br/>
+        <w:t>(</w:t>
+      </w:r>
+      <w:r>
+        <w:rPr>
+          <w:rFonts w:ascii="Cambria Math" w:hAnsi="Cambria Math" w:cs="Cambria Math"/>
+          <w:lang w:val="en-US"/>
+        </w:rPr>
+        <w:t>∃</w:t>
+      </w:r>
+      <w:r>
+        <w:rPr>
+          <w:lang w:val="en-US"/>
+        </w:rPr>
+        <w:t xml:space="preserve"> rule A → B a with a = s[j−1] and B derives </w:t>
+      </w:r>
+      <w:proofErr w:type="gramStart"/>
+      <w:r>
+        <w:rPr>
+          <w:lang w:val="en-US"/>
+        </w:rPr>
+        <w:t>s[</w:t>
+      </w:r>
+      <w:proofErr w:type="spellStart"/>
+      <w:proofErr w:type="gramEnd"/>
+      <w:r>
+        <w:rPr>
+          <w:lang w:val="en-US"/>
+        </w:rPr>
+        <w:t>i</w:t>
+      </w:r>
+      <w:proofErr w:type="spellEnd"/>
+      <w:r>
+        <w:rPr>
+          <w:lang w:val="en-US"/>
+        </w:rPr>
+        <w:t>, j−1)).</w:t>
+      </w:r>
+    </w:p>
+    <w:p>
+      <w:pPr>
+        <w:spacing w:after="120"/>
+        <w:jc w:val="both"/>
+        <w:rPr>
+          <w:lang w:val="en-US"/>
+        </w:rPr>
+      </w:pPr>
+      <w:r>
+        <w:rPr>
+          <w:lang w:val="en-US"/>
+        </w:rPr>
+        <w:t>No information is lost by fixing k this way, because the grammar itself guarantees that, whenever A → a B or A → B a is used, the terminal can only match at that one end of the substring; there is no other position the split could be at. We implement this bottom-up, by increasing substring length, exactly as in Step 2, but with the inner O(n) loop over k replaced by a direct check of the fixed position.</w:t>
+      </w:r>
+    </w:p>
+    <w:p>
+      <w:pPr>
+        <w:spacing w:after="120"/>
+        <w:jc w:val="both"/>
+        <w:rPr>
+          <w:lang w:val="en-US"/>
+        </w:rPr>
+      </w:pPr>
+    </w:p>
+    <w:tbl>
+      <w:tblPr>
+        <w:tblW w:w="5000" w:type="pct"/>
+        <w:tblBorders>
+          <w:top w:val="single" w:sz="2" w:space="0" w:color="999999"/>
+          <w:left w:val="single" w:sz="2" w:space="0" w:color="999999"/>
+          <w:bottom w:val="single" w:sz="2" w:space="0" w:color="999999"/>
+          <w:right w:val="single" w:sz="2" w:space="0" w:color="999999"/>
+          <w:insideH w:val="none" w:sz="0" w:space="0" w:color="FFFFFF"/>
+          <w:insideV w:val="none" w:sz="0" w:space="0" w:color="FFFFFF"/>
+        </w:tblBorders>
+        <w:tblCellMar>
+          <w:left w:w="10" w:type="dxa"/>
+          <w:right w:w="10" w:type="dxa"/>
+        </w:tblCellMar>
+        <w:tblLook w:val="0000" w:firstRow="0" w:lastRow="0" w:firstColumn="0" w:lastColumn="0" w:noHBand="0" w:noVBand="0"/>
+      </w:tblPr>
+      <w:tblGrid>
+        <w:gridCol w:w="6922"/>
+      </w:tblGrid>
+      <w:tr>
+        <w:tc>
+          <w:tcPr>
+            <w:tcW w:w="0" w:type="auto"/>
+            <w:shd w:val="clear" w:color="auto" w:fill="F2F2F2"/>
+            <w:tcMar>
+              <w:top w:w="120" w:type="dxa"/>
+              <w:left w:w="160" w:type="dxa"/>
+              <w:bottom w:w="120" w:type="dxa"/>
+              <w:right w:w="160" w:type="dxa"/>
+            </w:tcMar>
+          </w:tcPr>
+          <w:p>
+            <w:pPr>
+              <w:rPr>
+                <w:lang w:val="en-US"/>
+              </w:rPr>
+            </w:pPr>
+            <w:r>
+              <w:rPr>
+                <w:lang w:val="en-US"/>
+              </w:rPr>
+              <w:t xml:space="preserve">function </w:t>
+            </w:r>
+            <w:proofErr w:type="spellStart"/>
+            <w:r>
+              <w:rPr>
+                <w:lang w:val="en-US"/>
+              </w:rPr>
+              <w:t>parseLinearBU</w:t>
+            </w:r>
+            <w:proofErr w:type="spellEnd"/>
+            <w:r>
+              <w:rPr>
+                <w:lang w:val="en-US"/>
+              </w:rPr>
+              <w:t>(s</w:t>
+            </w:r>
+            <w:proofErr w:type="gramStart"/>
+            <w:r>
+              <w:rPr>
+                <w:lang w:val="en-US"/>
+              </w:rPr>
+              <w:t>):        #</w:t>
+            </w:r>
+            <w:proofErr w:type="gramEnd"/>
+            <w:r>
+              <w:rPr>
+                <w:lang w:val="en-US"/>
+              </w:rPr>
+              <w:t xml:space="preserve"> n = |s|</w:t>
+            </w:r>
+          </w:p>
+          <w:p>
+            <w:pPr>
+              <w:rPr>
+                <w:lang w:val="en-US"/>
+              </w:rPr>
+            </w:pPr>
+            <w:r>
+              <w:rPr>
+                <w:lang w:val="en-US"/>
+              </w:rPr>
+              <w:t xml:space="preserve">    for </w:t>
+            </w:r>
+            <w:proofErr w:type="spellStart"/>
+            <w:r>
+              <w:rPr>
+                <w:lang w:val="en-US"/>
+              </w:rPr>
+              <w:t>i</w:t>
+            </w:r>
+            <w:proofErr w:type="spellEnd"/>
+            <w:r>
+              <w:rPr>
+                <w:lang w:val="en-US"/>
+              </w:rPr>
+              <w:t xml:space="preserve"> = 0 to n-1:</w:t>
+            </w:r>
+          </w:p>
+          <w:p>
+            <w:pPr>
+              <w:rPr>
+                <w:lang w:val="en-US"/>
+              </w:rPr>
+            </w:pPr>
+            <w:r>
+              <w:rPr>
+                <w:lang w:val="en-US"/>
+              </w:rPr>
+              <w:t xml:space="preserve">        for each nonterminal A:</w:t>
+            </w:r>
+          </w:p>
+          <w:p>
+            <w:pPr>
+              <w:rPr>
+                <w:lang w:val="en-US"/>
+              </w:rPr>
+            </w:pPr>
+            <w:r>
+              <w:rPr>
+                <w:lang w:val="en-US"/>
+              </w:rPr>
+              <w:t xml:space="preserve">            table[A][</w:t>
+            </w:r>
+            <w:proofErr w:type="spellStart"/>
+            <w:proofErr w:type="gramStart"/>
+            <w:r>
+              <w:rPr>
+                <w:lang w:val="en-US"/>
+              </w:rPr>
+              <w:t>i</w:t>
+            </w:r>
+            <w:proofErr w:type="spellEnd"/>
+            <w:r>
+              <w:rPr>
+                <w:lang w:val="en-US"/>
+              </w:rPr>
+              <w:t>][</w:t>
+            </w:r>
+            <w:proofErr w:type="gramEnd"/>
+            <w:r>
+              <w:rPr>
+                <w:lang w:val="en-US"/>
+              </w:rPr>
+              <w:t>i+1] = (A -&gt; s[</w:t>
+            </w:r>
+            <w:proofErr w:type="spellStart"/>
+            <w:r>
+              <w:rPr>
+                <w:lang w:val="en-US"/>
+              </w:rPr>
+              <w:t>i</w:t>
+            </w:r>
+            <w:proofErr w:type="spellEnd"/>
+            <w:r>
+              <w:rPr>
+                <w:lang w:val="en-US"/>
+              </w:rPr>
+              <w:t>] is a rule)</w:t>
+            </w:r>
+          </w:p>
+          <w:p>
+            <w:pPr>
+              <w:rPr>
+                <w:lang w:val="en-US"/>
+              </w:rPr>
+            </w:pPr>
+            <w:r>
+              <w:rPr>
+                <w:lang w:val="en-US"/>
+              </w:rPr>
+              <w:t xml:space="preserve">    for </w:t>
+            </w:r>
+            <w:proofErr w:type="spellStart"/>
+            <w:r>
+              <w:rPr>
+                <w:lang w:val="en-US"/>
+              </w:rPr>
+              <w:t>len</w:t>
+            </w:r>
+            <w:proofErr w:type="spellEnd"/>
+            <w:r>
+              <w:rPr>
+                <w:lang w:val="en-US"/>
+              </w:rPr>
+              <w:t xml:space="preserve"> = 2 </w:t>
+            </w:r>
+            <w:proofErr w:type="spellStart"/>
+            <w:r>
+              <w:rPr>
+                <w:lang w:val="en-US"/>
+              </w:rPr>
+              <w:t>to n</w:t>
+            </w:r>
+            <w:proofErr w:type="spellEnd"/>
+            <w:r>
+              <w:rPr>
+                <w:lang w:val="en-US"/>
+              </w:rPr>
+              <w:t>:</w:t>
+            </w:r>
+          </w:p>
+          <w:p>
+            <w:pPr>
+              <w:rPr>
+                <w:lang w:val="en-US"/>
+              </w:rPr>
+            </w:pPr>
+            <w:r>
+              <w:rPr>
+                <w:lang w:val="en-US"/>
+              </w:rPr>
+              <w:t xml:space="preserve">        for </w:t>
+            </w:r>
+            <w:proofErr w:type="spellStart"/>
+            <w:r>
+              <w:rPr>
+                <w:lang w:val="en-US"/>
+              </w:rPr>
+              <w:t>i</w:t>
+            </w:r>
+            <w:proofErr w:type="spellEnd"/>
+            <w:r>
+              <w:rPr>
+                <w:lang w:val="en-US"/>
+              </w:rPr>
+              <w:t xml:space="preserve"> = 0 to n-</w:t>
+            </w:r>
+            <w:proofErr w:type="spellStart"/>
+            <w:r>
+              <w:rPr>
+                <w:lang w:val="en-US"/>
+              </w:rPr>
+              <w:t>len</w:t>
+            </w:r>
+            <w:proofErr w:type="spellEnd"/>
+            <w:r>
+              <w:rPr>
+                <w:lang w:val="en-US"/>
+              </w:rPr>
+              <w:t>:</w:t>
+            </w:r>
+          </w:p>
+          <w:p>
+            <w:pPr>
+              <w:rPr>
+                <w:lang w:val="en-US"/>
+              </w:rPr>
+            </w:pPr>
+            <w:r>
+              <w:rPr>
+                <w:lang w:val="en-US"/>
+              </w:rPr>
+              <w:t xml:space="preserve">            j = </w:t>
+            </w:r>
+            <w:proofErr w:type="spellStart"/>
+            <w:r>
+              <w:rPr>
+                <w:lang w:val="en-US"/>
+              </w:rPr>
+              <w:t>i</w:t>
+            </w:r>
+            <w:proofErr w:type="spellEnd"/>
+            <w:r>
+              <w:rPr>
+                <w:lang w:val="en-US"/>
+              </w:rPr>
+              <w:t xml:space="preserve"> + </w:t>
+            </w:r>
+            <w:proofErr w:type="spellStart"/>
+            <w:r>
+              <w:rPr>
+                <w:lang w:val="en-US"/>
+              </w:rPr>
+              <w:t>len</w:t>
+            </w:r>
+            <w:proofErr w:type="spellEnd"/>
+          </w:p>
+          <w:p>
+            <w:pPr>
+              <w:rPr>
+                <w:lang w:val="en-US"/>
+              </w:rPr>
+            </w:pPr>
+            <w:r>
+              <w:rPr>
+                <w:lang w:val="en-US"/>
+              </w:rPr>
+              <w:t xml:space="preserve">            for each nonterminal A:</w:t>
+            </w:r>
+          </w:p>
+          <w:p>
+            <w:pPr>
+              <w:rPr>
+                <w:lang w:val="en-US"/>
+              </w:rPr>
+            </w:pPr>
+            <w:r>
+              <w:rPr>
+                <w:lang w:val="en-US"/>
+              </w:rPr>
+              <w:t xml:space="preserve">                table[A][</w:t>
+            </w:r>
+            <w:proofErr w:type="spellStart"/>
+            <w:r>
+              <w:rPr>
+                <w:lang w:val="en-US"/>
+              </w:rPr>
+              <w:t>i</w:t>
+            </w:r>
+            <w:proofErr w:type="spellEnd"/>
+            <w:r>
+              <w:rPr>
+                <w:lang w:val="en-US"/>
+              </w:rPr>
+              <w:t>][j] = false</w:t>
+            </w:r>
+          </w:p>
+          <w:p>
+            <w:pPr>
+              <w:rPr>
+                <w:lang w:val="en-US"/>
+              </w:rPr>
+            </w:pPr>
+            <w:r>
+              <w:rPr>
+                <w:lang w:val="en-US"/>
+              </w:rPr>
+              <w:t xml:space="preserve">                for each rule A -&gt; a B with a = s[</w:t>
+            </w:r>
+            <w:proofErr w:type="spellStart"/>
+            <w:r>
+              <w:rPr>
+                <w:lang w:val="en-US"/>
+              </w:rPr>
+              <w:t>i</w:t>
+            </w:r>
+            <w:proofErr w:type="spellEnd"/>
+            <w:r>
+              <w:rPr>
+                <w:lang w:val="en-US"/>
+              </w:rPr>
+              <w:t>]:</w:t>
+            </w:r>
+          </w:p>
+          <w:p>
+            <w:pPr>
+              <w:rPr>
+                <w:lang w:val="en-US"/>
+              </w:rPr>
+            </w:pPr>
+            <w:r>
+              <w:rPr>
+                <w:lang w:val="en-US"/>
+              </w:rPr>
+              <w:t xml:space="preserve">                    if table[B][i+</w:t>
+            </w:r>
+            <w:proofErr w:type="gramStart"/>
+            <w:r>
+              <w:rPr>
+                <w:lang w:val="en-US"/>
+              </w:rPr>
+              <w:t>1][</w:t>
+            </w:r>
+            <w:proofErr w:type="gramEnd"/>
+            <w:r>
+              <w:rPr>
+                <w:lang w:val="en-US"/>
+              </w:rPr>
+              <w:t>j]:</w:t>
+            </w:r>
+          </w:p>
+          <w:p>
+            <w:pPr>
+              <w:rPr>
+                <w:lang w:val="en-US"/>
+              </w:rPr>
+            </w:pPr>
+            <w:r>
+              <w:rPr>
+                <w:lang w:val="en-US"/>
+              </w:rPr>
+              <w:t xml:space="preserve">                        table[A][</w:t>
+            </w:r>
+            <w:proofErr w:type="spellStart"/>
+            <w:r>
+              <w:rPr>
+                <w:lang w:val="en-US"/>
+              </w:rPr>
+              <w:t>i</w:t>
+            </w:r>
+            <w:proofErr w:type="spellEnd"/>
+            <w:r>
+              <w:rPr>
+                <w:lang w:val="en-US"/>
+              </w:rPr>
+              <w:t>][j] = true; break</w:t>
+            </w:r>
+          </w:p>
+          <w:p>
+            <w:pPr>
+              <w:rPr>
+                <w:lang w:val="en-US"/>
+              </w:rPr>
+            </w:pPr>
+            <w:r>
+              <w:rPr>
+                <w:lang w:val="en-US"/>
+              </w:rPr>
+              <w:t xml:space="preserve">                if not table[A][</w:t>
+            </w:r>
+            <w:proofErr w:type="spellStart"/>
+            <w:r>
+              <w:rPr>
+                <w:lang w:val="en-US"/>
+              </w:rPr>
+              <w:t>i</w:t>
+            </w:r>
+            <w:proofErr w:type="spellEnd"/>
+            <w:r>
+              <w:rPr>
+                <w:lang w:val="en-US"/>
+              </w:rPr>
+              <w:t>][j]:</w:t>
+            </w:r>
+          </w:p>
+          <w:p>
+            <w:pPr>
+              <w:rPr>
+                <w:lang w:val="en-US"/>
+              </w:rPr>
+            </w:pPr>
+            <w:r>
+              <w:rPr>
+                <w:lang w:val="en-US"/>
+              </w:rPr>
+              <w:t xml:space="preserve">                    for each rule A -&gt; B a with a = s[j-1]:</w:t>
+            </w:r>
+          </w:p>
+          <w:p>
+            <w:pPr>
+              <w:rPr>
+                <w:lang w:val="en-US"/>
+              </w:rPr>
+            </w:pPr>
+            <w:r>
+              <w:rPr>
+                <w:lang w:val="en-US"/>
+              </w:rPr>
+              <w:lastRenderedPageBreak/>
+              <w:t xml:space="preserve">                        if table[B][</w:t>
+            </w:r>
+            <w:proofErr w:type="spellStart"/>
+            <w:proofErr w:type="gramStart"/>
+            <w:r>
+              <w:rPr>
+                <w:lang w:val="en-US"/>
+              </w:rPr>
+              <w:t>i</w:t>
+            </w:r>
+            <w:proofErr w:type="spellEnd"/>
+            <w:r>
+              <w:rPr>
+                <w:lang w:val="en-US"/>
+              </w:rPr>
+              <w:t>][</w:t>
+            </w:r>
+            <w:proofErr w:type="gramEnd"/>
+            <w:r>
+              <w:rPr>
+                <w:lang w:val="en-US"/>
+              </w:rPr>
+              <w:t>j-1]:</w:t>
+            </w:r>
+          </w:p>
+          <w:p>
+            <w:pPr>
+              <w:rPr>
+                <w:lang w:val="en-US"/>
+              </w:rPr>
+            </w:pPr>
+            <w:r>
+              <w:rPr>
+                <w:lang w:val="en-US"/>
+              </w:rPr>
+              <w:t xml:space="preserve">                            table[A][</w:t>
+            </w:r>
+            <w:proofErr w:type="spellStart"/>
+            <w:r>
+              <w:rPr>
+                <w:lang w:val="en-US"/>
+              </w:rPr>
+              <w:t>i</w:t>
+            </w:r>
+            <w:proofErr w:type="spellEnd"/>
+            <w:r>
+              <w:rPr>
+                <w:lang w:val="en-US"/>
+              </w:rPr>
+              <w:t>][j] = true; break</w:t>
+            </w:r>
+          </w:p>
+          <w:p>
+            <w:pPr>
+              <w:rPr>
+                <w:lang w:val="en-US"/>
+              </w:rPr>
+            </w:pPr>
+            <w:r>
+              <w:rPr>
+                <w:lang w:val="en-US"/>
+              </w:rPr>
+              <w:t xml:space="preserve">    return table[S][0][n]</w:t>
+            </w:r>
+          </w:p>
+        </w:tc>
+      </w:tr>
+    </w:tbl>
+    <w:p>
+      <w:pPr>
+        <w:spacing w:after="120"/>
+        <w:jc w:val="both"/>
+        <w:rPr>
+          <w:lang w:val="en-US"/>
+        </w:rPr>
+      </w:pPr>
+    </w:p>
+    <w:p>
+      <w:pPr>
+        <w:spacing w:after="120"/>
+        <w:jc w:val="both"/>
+        <w:rPr>
+          <w:lang w:val="en-US"/>
+        </w:rPr>
+      </w:pPr>
+    </w:p>
+    <w:p>
+      <w:pPr>
+        <w:spacing w:after="120"/>
+        <w:jc w:val="both"/>
+        <w:rPr>
+          <w:lang w:val="en-US"/>
+        </w:rPr>
+      </w:pPr>
+      <w:r>
+        <w:rPr>
+          <w:b/>
+          <w:bCs/>
+          <w:lang w:val="en-US"/>
+        </w:rPr>
+        <w:t>Complexity</w:t>
+      </w:r>
+      <w:r>
+        <w:rPr>
+          <w:lang w:val="en-US"/>
+        </w:rPr>
+        <w:t>. There are O(n²) pairs (</w:t>
+      </w:r>
+      <w:proofErr w:type="spellStart"/>
+      <w:r>
+        <w:rPr>
+          <w:lang w:val="en-US"/>
+        </w:rPr>
+        <w:t>i</w:t>
+      </w:r>
+      <w:proofErr w:type="spellEnd"/>
+      <w:r>
+        <w:rPr>
+          <w:lang w:val="en-US"/>
+        </w:rPr>
+        <w:t xml:space="preserve">, j). For a fixed pair, the algorithm checks, for every nonterminal A, the rules A → a B and A → B a, doing </w:t>
+      </w:r>
+      <w:proofErr w:type="gramStart"/>
+      <w:r>
+        <w:rPr>
+          <w:lang w:val="en-US"/>
+        </w:rPr>
+        <w:t>O(</w:t>
+      </w:r>
+      <w:proofErr w:type="gramEnd"/>
+      <w:r>
+        <w:rPr>
+          <w:lang w:val="en-US"/>
+        </w:rPr>
+        <w:t xml:space="preserve">1) work per rule (one array lookup and one character comparison). Summed over all </w:t>
+      </w:r>
+      <w:proofErr w:type="spellStart"/>
+      <w:r>
+        <w:rPr>
+          <w:lang w:val="en-US"/>
+        </w:rPr>
+        <w:t>nonterminals</w:t>
+      </w:r>
+      <w:proofErr w:type="spellEnd"/>
+      <w:r>
+        <w:rPr>
+          <w:lang w:val="en-US"/>
+        </w:rPr>
+        <w:t>, this is O(|R|) work per pair (</w:t>
+      </w:r>
+      <w:proofErr w:type="spellStart"/>
+      <w:r>
+        <w:rPr>
+          <w:lang w:val="en-US"/>
+        </w:rPr>
+        <w:t>i</w:t>
+      </w:r>
+      <w:proofErr w:type="spellEnd"/>
+      <w:r>
+        <w:rPr>
+          <w:lang w:val="en-US"/>
+        </w:rPr>
+        <w:t>, j), since every rule is associated with exactly one left-hand side. Hence the total running time is</w:t>
+      </w:r>
+    </w:p>
+    <w:p>
+      <w:pPr>
+        <w:spacing w:after="120"/>
+        <w:jc w:val="both"/>
+        <w:rPr>
+          <w:lang w:val="en-US"/>
+        </w:rPr>
+      </w:pPr>
+      <w:r>
+        <w:rPr>
+          <w:lang w:val="en-US"/>
+        </w:rPr>
+        <w:t xml:space="preserve">T(n) = </w:t>
+      </w:r>
+      <w:proofErr w:type="gramStart"/>
+      <w:r>
+        <w:rPr>
+          <w:lang w:val="en-US"/>
+        </w:rPr>
+        <w:t>O(</w:t>
+      </w:r>
+      <w:proofErr w:type="gramEnd"/>
+      <w:r>
+        <w:rPr>
+          <w:lang w:val="en-US"/>
+        </w:rPr>
+        <w:t>|R| · n²),</w:t>
+      </w:r>
+    </w:p>
+    <w:p>
+      <w:pPr>
+        <w:spacing w:after="120"/>
+        <w:jc w:val="both"/>
+        <w:rPr>
+          <w:lang w:val="en-US"/>
+        </w:rPr>
+      </w:pPr>
+      <w:r>
+        <w:rPr>
+          <w:lang w:val="en-US"/>
+        </w:rPr>
+        <w:t xml:space="preserve">compared with </w:t>
+      </w:r>
+      <w:proofErr w:type="gramStart"/>
+      <w:r>
+        <w:rPr>
+          <w:lang w:val="en-US"/>
+        </w:rPr>
+        <w:t>O(</w:t>
+      </w:r>
+      <w:proofErr w:type="gramEnd"/>
+      <w:r>
+        <w:rPr>
+          <w:lang w:val="en-US"/>
+        </w:rPr>
+        <w:t xml:space="preserve">|V| · |R| · n³) for the general algorithm on the same grammar after conversion. The extra factor |V| disappears together with the factor n, because fixing the split point removes the need to try all </w:t>
+      </w:r>
+      <w:proofErr w:type="spellStart"/>
+      <w:r>
+        <w:rPr>
+          <w:lang w:val="en-US"/>
+        </w:rPr>
+        <w:t>nonterminals</w:t>
+      </w:r>
+      <w:proofErr w:type="spellEnd"/>
+      <w:r>
+        <w:rPr>
+          <w:lang w:val="en-US"/>
+        </w:rPr>
+        <w:t xml:space="preserve"> "in between" two independently varying endpoints the way the general recurrence does. The space complexity remains </w:t>
+      </w:r>
+      <w:proofErr w:type="gramStart"/>
+      <w:r>
+        <w:rPr>
+          <w:lang w:val="en-US"/>
+        </w:rPr>
+        <w:t>O(</w:t>
+      </w:r>
+      <w:proofErr w:type="gramEnd"/>
+      <w:r>
+        <w:rPr>
+          <w:lang w:val="en-US"/>
+        </w:rPr>
+        <w:t>|V| · n²) for the table, unchanged from the general algorithm.</w:t>
+      </w:r>
+    </w:p>
+    <w:p>
+      <w:pPr>
+        <w:spacing w:after="120"/>
+        <w:jc w:val="both"/>
+        <w:rPr>
+          <w:b/>
+          <w:bCs/>
+          <w:lang w:val="en-US"/>
+        </w:rPr>
+      </w:pPr>
+      <w:r>
+        <w:rPr>
+          <w:b/>
+          <w:bCs/>
+          <w:lang w:val="en-US"/>
+        </w:rPr>
+        <w:t>7.4 Hypotheses to Test Experimentally</w:t>
+      </w:r>
+    </w:p>
+    <w:p>
+      <w:pPr>
+        <w:spacing w:after="120"/>
+        <w:jc w:val="both"/>
+        <w:rPr>
+          <w:lang w:val="en-US"/>
+        </w:rPr>
+      </w:pPr>
+      <w:r>
+        <w:rPr>
+          <w:lang w:val="en-US"/>
+        </w:rPr>
+        <w:t>Before running any experiment, we state the following expectations, to be confronted with the measurements in the results section:</w:t>
+      </w:r>
+    </w:p>
+    <w:p>
+      <w:pPr>
+        <w:numPr>
+          <w:ilvl w:val="0"/>
+          <w:numId w:val="3"/>
+        </w:numPr>
+        <w:spacing w:after="120"/>
+        <w:jc w:val="both"/>
+        <w:rPr>
+          <w:lang w:val="en-US"/>
+        </w:rPr>
+      </w:pPr>
+      <w:r>
+        <w:rPr>
+          <w:lang w:val="en-US"/>
+        </w:rPr>
+        <w:t>H1. Method 1 (preprocessing + general CYK) shows cubic growth in n, regardless of the grammar being linear, because the general algorithm does not exploit the restriction.</w:t>
+      </w:r>
+    </w:p>
+    <w:p>
+      <w:pPr>
+        <w:numPr>
+          <w:ilvl w:val="0"/>
+          <w:numId w:val="3"/>
+        </w:numPr>
+        <w:spacing w:after="120"/>
+        <w:jc w:val="both"/>
+        <w:rPr>
+          <w:lang w:val="en-US"/>
+        </w:rPr>
+      </w:pPr>
+      <w:r>
+        <w:rPr>
+          <w:lang w:val="en-US"/>
+        </w:rPr>
+        <w:t xml:space="preserve">H2. Method 2 (specialized algorithm) shows quadratic growth in n, matching the </w:t>
+      </w:r>
+      <w:proofErr w:type="gramStart"/>
+      <w:r>
+        <w:rPr>
+          <w:lang w:val="en-US"/>
+        </w:rPr>
+        <w:t>O(</w:t>
+      </w:r>
+      <w:proofErr w:type="gramEnd"/>
+      <w:r>
+        <w:rPr>
+          <w:lang w:val="en-US"/>
+        </w:rPr>
+        <w:t>|R| n²) bound derived above.</w:t>
+      </w:r>
+    </w:p>
+    <w:p>
+      <w:pPr>
+        <w:numPr>
+          <w:ilvl w:val="0"/>
+          <w:numId w:val="3"/>
+        </w:numPr>
+        <w:spacing w:after="120"/>
+        <w:jc w:val="both"/>
+        <w:rPr>
+          <w:lang w:val="en-US"/>
+        </w:rPr>
+      </w:pPr>
+      <w:r>
+        <w:rPr>
+          <w:lang w:val="en-US"/>
+        </w:rPr>
+        <w:t xml:space="preserve">H3. For small n, Method 1 may be as fast as or faster than Method 2 in wall-clock time, due to constant-factor effects but Method 2 should overtake it once n is large enough that the extra factor of n in Method 1 dominates. </w:t>
+      </w:r>
+    </w:p>
+    <w:p>
+      <w:pPr>
+        <w:numPr>
+          <w:ilvl w:val="0"/>
+          <w:numId w:val="3"/>
+        </w:numPr>
+        <w:spacing w:after="120"/>
+        <w:jc w:val="both"/>
+        <w:rPr>
+          <w:lang w:val="en-US"/>
+        </w:rPr>
+      </w:pPr>
+      <w:r>
+        <w:rPr>
+          <w:lang w:val="en-US"/>
+        </w:rPr>
+        <w:t xml:space="preserve">H4. </w:t>
+      </w:r>
+      <w:r>
+        <w:rPr>
+          <w:lang w:val="en-US"/>
+        </w:rPr>
+        <w:t xml:space="preserve">Because Method 2 never searches over split points, the cost of each table entry is </w:t>
+      </w:r>
+      <w:proofErr w:type="gramStart"/>
+      <w:r>
+        <w:rPr>
+          <w:lang w:val="en-US"/>
+        </w:rPr>
+        <w:t>bounded</w:t>
+      </w:r>
+      <w:proofErr w:type="gramEnd"/>
+      <w:r>
+        <w:rPr>
+          <w:lang w:val="en-US"/>
+        </w:rPr>
+        <w:t xml:space="preserve"> by the number of applicable rules, not by the position of a symbol within the string. We</w:t>
+      </w:r>
+      <w:r>
+        <w:rPr>
+          <w:lang w:val="en-US"/>
+        </w:rPr>
+        <w:t xml:space="preserve"> </w:t>
+      </w:r>
+      <w:r>
+        <w:rPr>
+          <w:lang w:val="en-US"/>
+        </w:rPr>
+        <w:t>expect the position of an invalid symbol to have little or no effect on the operation count of Method 2, unlike the general CYK algorithm of Step 2, where an error near the end of the string was markedly more expensive than one at the start</w:t>
+      </w:r>
+      <w:r>
+        <w:rPr>
+          <w:lang w:val="en-US"/>
+        </w:rPr>
+        <w:t xml:space="preserve">. </w:t>
+      </w:r>
+      <w:r>
+        <w:rPr>
+          <w:lang w:val="en-US"/>
+        </w:rPr>
+        <w:t>For Method 1, which reuses the general algorithm, we expect that same effect to persist, since nothing in the preprocessing changes how the general algorithm searches.</w:t>
+      </w:r>
+    </w:p>
+    <w:p>
+      <w:pPr>
+        <w:spacing w:after="120"/>
+        <w:jc w:val="both"/>
+        <w:rPr>
+          <w:b/>
+          <w:bCs/>
+          <w:lang w:val="en-US"/>
+        </w:rPr>
+      </w:pPr>
+    </w:p>
+    <w:p>
+      <w:pPr>
+        <w:pStyle w:val="Ttulo1"/>
+        <w:rPr>
+          <w:lang w:val="en-US"/>
+        </w:rPr>
+      </w:pPr>
+    </w:p>
+    <w:p>
+      <w:pPr>
+        <w:pStyle w:val="Ttulo1"/>
+        <w:rPr>
+          <w:lang w:val="en-US"/>
+        </w:rPr>
+      </w:pPr>
+      <w:r>
+        <w:rPr>
+          <w:lang w:val="en-US"/>
+        </w:rPr>
+        <w:lastRenderedPageBreak/>
         <w:t>References</w:t>
       </w:r>
     </w:p>
@@ -18261,6 +19760,155 @@
     </w:lvl>
   </w:abstractNum>
   <w:abstractNum w:abstractNumId="1" w15:restartNumberingAfterBreak="0">
+    <w:nsid w:val="60FF68DA"/>
+    <w:multiLevelType w:val="multilevel"/>
+    <w:tmpl w:val="A560BC0C"/>
+    <w:lvl w:ilvl="0">
+      <w:start w:val="1"/>
+      <w:numFmt w:val="bullet"/>
+      <w:lvlText w:val=""/>
+      <w:lvlJc w:val="left"/>
+      <w:pPr>
+        <w:tabs>
+          <w:tab w:val="num" w:pos="720"/>
+        </w:tabs>
+        <w:ind w:left="720" w:hanging="360"/>
+      </w:pPr>
+      <w:rPr>
+        <w:rFonts w:ascii="Symbol" w:hAnsi="Symbol" w:hint="default"/>
+        <w:sz w:val="20"/>
+      </w:rPr>
+    </w:lvl>
+    <w:lvl w:ilvl="1" w:tentative="1">
+      <w:start w:val="1"/>
+      <w:numFmt w:val="bullet"/>
+      <w:lvlText w:val="o"/>
+      <w:lvlJc w:val="left"/>
+      <w:pPr>
+        <w:tabs>
+          <w:tab w:val="num" w:pos="1440"/>
+        </w:tabs>
+        <w:ind w:left="1440" w:hanging="360"/>
+      </w:pPr>
+      <w:rPr>
+        <w:rFonts w:ascii="Courier New" w:hAnsi="Courier New" w:hint="default"/>
+        <w:sz w:val="20"/>
+      </w:rPr>
+    </w:lvl>
+    <w:lvl w:ilvl="2" w:tentative="1">
+      <w:start w:val="1"/>
+      <w:numFmt w:val="bullet"/>
+      <w:lvlText w:val=""/>
+      <w:lvlJc w:val="left"/>
+      <w:pPr>
+        <w:tabs>
+          <w:tab w:val="num" w:pos="2160"/>
+        </w:tabs>
+        <w:ind w:left="2160" w:hanging="360"/>
+      </w:pPr>
+      <w:rPr>
+        <w:rFonts w:ascii="Wingdings" w:hAnsi="Wingdings" w:hint="default"/>
+        <w:sz w:val="20"/>
+      </w:rPr>
+    </w:lvl>
+    <w:lvl w:ilvl="3" w:tentative="1">
+      <w:start w:val="1"/>
+      <w:numFmt w:val="bullet"/>
+      <w:lvlText w:val=""/>
+      <w:lvlJc w:val="left"/>
+      <w:pPr>
+        <w:tabs>
+          <w:tab w:val="num" w:pos="2880"/>
+        </w:tabs>
+        <w:ind w:left="2880" w:hanging="360"/>
+      </w:pPr>
+      <w:rPr>
+        <w:rFonts w:ascii="Wingdings" w:hAnsi="Wingdings" w:hint="default"/>
+        <w:sz w:val="20"/>
+      </w:rPr>
+    </w:lvl>
+    <w:lvl w:ilvl="4" w:tentative="1">
+      <w:start w:val="1"/>
+      <w:numFmt w:val="bullet"/>
+      <w:lvlText w:val=""/>
+      <w:lvlJc w:val="left"/>
+      <w:pPr>
+        <w:tabs>
+          <w:tab w:val="num" w:pos="3600"/>
+        </w:tabs>
+        <w:ind w:left="3600" w:hanging="360"/>
+      </w:pPr>
+      <w:rPr>
+        <w:rFonts w:ascii="Wingdings" w:hAnsi="Wingdings" w:hint="default"/>
+        <w:sz w:val="20"/>
+      </w:rPr>
+    </w:lvl>
+    <w:lvl w:ilvl="5" w:tentative="1">
+      <w:start w:val="1"/>
+      <w:numFmt w:val="bullet"/>
+      <w:lvlText w:val=""/>
+      <w:lvlJc w:val="left"/>
+      <w:pPr>
+        <w:tabs>
+          <w:tab w:val="num" w:pos="4320"/>
+        </w:tabs>
+        <w:ind w:left="4320" w:hanging="360"/>
+      </w:pPr>
+      <w:rPr>
+        <w:rFonts w:ascii="Wingdings" w:hAnsi="Wingdings" w:hint="default"/>
+        <w:sz w:val="20"/>
+      </w:rPr>
+    </w:lvl>
+    <w:lvl w:ilvl="6" w:tentative="1">
+      <w:start w:val="1"/>
+      <w:numFmt w:val="bullet"/>
+      <w:lvlText w:val=""/>
+      <w:lvlJc w:val="left"/>
+      <w:pPr>
+        <w:tabs>
+          <w:tab w:val="num" w:pos="5040"/>
+        </w:tabs>
+        <w:ind w:left="5040" w:hanging="360"/>
+      </w:pPr>
+      <w:rPr>
+        <w:rFonts w:ascii="Wingdings" w:hAnsi="Wingdings" w:hint="default"/>
+        <w:sz w:val="20"/>
+      </w:rPr>
+    </w:lvl>
+    <w:lvl w:ilvl="7" w:tentative="1">
+      <w:start w:val="1"/>
+      <w:numFmt w:val="bullet"/>
+      <w:lvlText w:val=""/>
+      <w:lvlJc w:val="left"/>
+      <w:pPr>
+        <w:tabs>
+          <w:tab w:val="num" w:pos="5760"/>
+        </w:tabs>
+        <w:ind w:left="5760" w:hanging="360"/>
+      </w:pPr>
+      <w:rPr>
+        <w:rFonts w:ascii="Wingdings" w:hAnsi="Wingdings" w:hint="default"/>
+        <w:sz w:val="20"/>
+      </w:rPr>
+    </w:lvl>
+    <w:lvl w:ilvl="8" w:tentative="1">
+      <w:start w:val="1"/>
+      <w:numFmt w:val="bullet"/>
+      <w:lvlText w:val=""/>
+      <w:lvlJc w:val="left"/>
+      <w:pPr>
+        <w:tabs>
+          <w:tab w:val="num" w:pos="6480"/>
+        </w:tabs>
+        <w:ind w:left="6480" w:hanging="360"/>
+      </w:pPr>
+      <w:rPr>
+        <w:rFonts w:ascii="Wingdings" w:hAnsi="Wingdings" w:hint="default"/>
+        <w:sz w:val="20"/>
+      </w:rPr>
+    </w:lvl>
+  </w:abstractNum>
+  <w:abstractNum w:abstractNumId="2" w15:restartNumberingAfterBreak="0">
     <w:nsid w:val="72044812"/>
     <w:multiLevelType w:val="hybridMultilevel"/>
     <w:tmpl w:val="203AB57A"/>
@@ -18347,7 +19995,7 @@
     </w:lvl>
   </w:abstractNum>
   <w:num w:numId="1" w16cid:durableId="190656362">
-    <w:abstractNumId w:val="1"/>
+    <w:abstractNumId w:val="2"/>
     <w:lvlOverride w:ilvl="0">
       <w:startOverride w:val="1"/>
     </w:lvlOverride>
@@ -18357,6 +20005,9 @@
     <w:lvlOverride w:ilvl="0">
       <w:startOverride w:val="1"/>
     </w:lvlOverride>
+  </w:num>
+  <w:num w:numId="3" w16cid:durableId="1348366462">
+    <w:abstractNumId w:val="1"/>
   </w:num>
 </w:numbering>
 </file>
@@ -18753,6 +20404,7 @@
   <w:style w:type="paragraph" w:default="1" w:styleId="Normal">
     <w:name w:val="Normal"/>
     <w:qFormat/>
+    <w:rsid w:val="00322279"/>
   </w:style>
   <w:style w:type="paragraph" w:styleId="Ttulo1">
     <w:name w:val="heading 1"/>

</xml_diff>